<commit_message>
EAPC-2026-53 L1: dades de l'annex 14, termini i plantilles de l'EAPC emplenades
- Escrit, DR, relació i conveni amb les dades del representant i dels poders,
  data de recepció (29/09/2026) i paritat compromesa (17 docents, 52,9 % dones).
- Índex de l'escrit amb l'espai del Sobre Digital de cada document.
- Plantilles complementàries de l'EAPC (solvència econòmica, tècnica i
  disposició de mitjans) emplenades com a portada de cada espai.
- Guia: termini fins al 14/10/2026, dades a comprovar i repartiment per espais.

Co-Authored-By: Claude Opus 5.5 <noreply@anthropic.com>
Claude-Session: https://claude.ai/code/session_01UnwSqujbqZGJWPhwR4jWPM
</commit_message>
<xml_diff>
--- a/projectes/EAPC/EAPC-2026-53_AM_TIC/requeriment_150-2/01_Escrit_resposta_requeriment_EAPC-2026-53_L1.docx
+++ b/projectes/EAPC/EAPC-2026-53_AM_TIC/requeriment_150-2/01_Escrit_resposta_requeriment_EAPC-2026-53_L1.docx
@@ -409,10 +409,8 @@
                 <w:bCs w:val="false"/>
                 <w:sz w:val="19"/>
                 <w:szCs w:val="19"/>
-                <w:highlight w:val="yellow"/>
-                <w:highlightCs w:val="yellow"/>
-              </w:rPr>
-              <w:t xml:space="preserve">[dd/mm/2026]</w:t>
+              </w:rPr>
+              <w:t xml:space="preserve">29/09/2026</w:t>
             </w:r>
           </w:p>
         </w:tc>
@@ -429,44 +427,27 @@
         <w:jc w:val="both"/>
       </w:pPr>
       <w:r>
+        <w:t xml:space="preserve">Rafael Cortés </w:t>
+      </w:r>
+      <w:r>
         <w:rPr>
           <w:highlight w:val="yellow"/>
           <w:highlightCs w:val="yellow"/>
         </w:rPr>
-        <w:t xml:space="preserve">[Nom i cognoms]</w:t>
-      </w:r>
-      <w:r>
-        <w:t xml:space="preserve">, amb NIF </w:t>
+        <w:t xml:space="preserve">[Contreras]</w:t>
+      </w:r>
+      <w:r>
+        <w:t xml:space="preserve">, amb NIF 39912250M, en nom i representació de MULTIMÈDIA TARRAGONA, SL, amb NIF B43492784 i domicili social a </w:t>
       </w:r>
       <w:r>
         <w:rPr>
           <w:highlight w:val="yellow"/>
           <w:highlightCs w:val="yellow"/>
         </w:rPr>
-        <w:t xml:space="preserve">[00000000X]</w:t>
-      </w:r>
-      <w:r>
-        <w:t xml:space="preserve">, en nom i representació de MULTIMÈDIA TARRAGONA, SL, amb NIF B43492784 i domicili al carrer Apodaca, 6, 1r A, 43004 Tarragona, en la seva condició de </w:t>
-      </w:r>
-      <w:r>
-        <w:rPr>
-          <w:highlight w:val="yellow"/>
-          <w:highlightCs w:val="yellow"/>
-        </w:rPr>
-        <w:t xml:space="preserve">[càrrec]</w:t>
-      </w:r>
-      <w:r>
-        <w:t xml:space="preserve">, segons </w:t>
-      </w:r>
-      <w:r>
-        <w:rPr>
-          <w:highlight w:val="yellow"/>
-          <w:highlightCs w:val="yellow"/>
-        </w:rPr>
-        <w:t xml:space="preserve">[escriptura de poders atorgada davant el notari ... en data ... amb núm. de protocol ... / inscripció al registre RELIC o Representa]</w:t>
-      </w:r>
-      <w:r>
-        <w:t xml:space="preserve">,</w:t>
+        <w:t xml:space="preserve">[C. Joana Jugan, 2, Tarragona (segons l'oferta) / C. Apodaca, 6, 1r A, 43004 Tarragona (segons el requeriment): comprovar el domicili social]</w:t>
+      </w:r>
+      <w:r>
+        <w:t xml:space="preserve">, segons poders atorgats davant el notari Manuel Carlos Estrada del Castillo en data 13/12/2018, amb número de protocol 2654,</w:t>
       </w:r>
     </w:p>
     <w:p>
@@ -491,17 +472,7 @@
         <w:jc w:val="both"/>
       </w:pPr>
       <w:r>
-        <w:t xml:space="preserve">Primer. Que en data </w:t>
-      </w:r>
-      <w:r>
-        <w:rPr>
-          <w:highlight w:val="yellow"/>
-          <w:highlightCs w:val="yellow"/>
-        </w:rPr>
-        <w:t xml:space="preserve">[dd/mm/2026]</w:t>
-      </w:r>
-      <w:r>
-        <w:t xml:space="preserve"> aquesta empresa ha rebut el requeriment de documentació de l'expedient de referència, en què se'ns comunica que hem estat proposats com a adjudicataris del lot 1 de l'Acord marc i se'ns requereix que, en el termini de 10 dies hàbils, aportem la documentació prevista a l'article 150.2 de la LCSP i a la clàusula catorzena del Plec de clàusules administratives particulars (PCAP).</w:t>
+        <w:t xml:space="preserve">Primer. Que en data 29 de setembre de 2026 aquesta empresa ha rebut el requeriment de documentació de l'expedient de referència, en què se'ns comunica que hem estat proposats com a adjudicataris del lot 1 de l'Acord marc i se'ns requereix que, en el termini de 10 dies hàbils, aportem la documentació prevista a l'article 150.2 de la LCSP i a la clàusula catorzena del Plec de clàusules administratives particulars (PCAP).</w:t>
       </w:r>
     </w:p>
     <w:p>
@@ -511,7 +482,7 @@
         <w:jc w:val="both"/>
       </w:pPr>
       <w:r>
-        <w:t xml:space="preserve">Segon. Que, dins del termini atorgat, presentem a l'espai corresponent del Sobre Digital la documentació següent:</w:t>
+        <w:t xml:space="preserve">Segon. Que, dins del termini atorgat, presentem als espais corresponents del Sobre Digital aquest escrit i la documentació següent. Cada espai inclou, com a portada, la plantilla complementària de l'EAPC emplenada amb la relació dels documents que s'hi aporten:</w:t>
       </w:r>
     </w:p>
     <w:tbl>
@@ -527,9 +498,10 @@
         </w:tblBorders>
       </w:tblPr>
       <w:tblGrid>
-        <w:gridCol w:w="700"/>
-        <w:gridCol w:w="5170"/>
-        <w:gridCol w:w="3200"/>
+        <w:gridCol w:w="600"/>
+        <w:gridCol w:w="4300"/>
+        <w:gridCol w:w="2370"/>
+        <w:gridCol w:w="1800"/>
       </w:tblGrid>
       <w:tr>
         <w:trPr>
@@ -538,7 +510,7 @@
         </w:trPr>
         <w:tc>
           <w:tcPr>
-            <w:tcW w:type="dxa" w:w="700"/>
+            <w:tcW w:type="dxa" w:w="600"/>
             <w:tcBorders>
               <w:top w:val="single" w:color="808080" w:sz="4"/>
               <w:left w:val="single" w:color="808080" w:sz="4"/>
@@ -561,8 +533,8 @@
               <w:rPr>
                 <w:b/>
                 <w:bCs/>
-                <w:sz w:val="18"/>
-                <w:szCs w:val="18"/>
+                <w:sz w:val="17"/>
+                <w:szCs w:val="17"/>
               </w:rPr>
               <w:t xml:space="preserve">Doc.</w:t>
             </w:r>
@@ -570,7 +542,7 @@
         </w:tc>
         <w:tc>
           <w:tcPr>
-            <w:tcW w:type="dxa" w:w="5170"/>
+            <w:tcW w:type="dxa" w:w="4300"/>
             <w:tcBorders>
               <w:top w:val="single" w:color="808080" w:sz="4"/>
               <w:left w:val="single" w:color="808080" w:sz="4"/>
@@ -593,8 +565,8 @@
               <w:rPr>
                 <w:b/>
                 <w:bCs/>
-                <w:sz w:val="18"/>
-                <w:szCs w:val="18"/>
+                <w:sz w:val="17"/>
+                <w:szCs w:val="17"/>
               </w:rPr>
               <w:t xml:space="preserve">Contingut</w:t>
             </w:r>
@@ -602,7 +574,7 @@
         </w:tc>
         <w:tc>
           <w:tcPr>
-            <w:tcW w:type="dxa" w:w="3200"/>
+            <w:tcW w:type="dxa" w:w="2370"/>
             <w:tcBorders>
               <w:top w:val="single" w:color="808080" w:sz="4"/>
               <w:left w:val="single" w:color="808080" w:sz="4"/>
@@ -625,10 +597,42 @@
               <w:rPr>
                 <w:b/>
                 <w:bCs/>
-                <w:sz w:val="18"/>
-                <w:szCs w:val="18"/>
+                <w:sz w:val="17"/>
+                <w:szCs w:val="17"/>
               </w:rPr>
               <w:t xml:space="preserve">Requisit que acredita</w:t>
+            </w:r>
+          </w:p>
+        </w:tc>
+        <w:tc>
+          <w:tcPr>
+            <w:tcW w:type="dxa" w:w="1800"/>
+            <w:tcBorders>
+              <w:top w:val="single" w:color="808080" w:sz="4"/>
+              <w:left w:val="single" w:color="808080" w:sz="4"/>
+              <w:bottom w:val="single" w:color="808080" w:sz="4"/>
+              <w:right w:val="single" w:color="808080" w:sz="4"/>
+            </w:tcBorders>
+            <w:shd w:fill="D9E2F3" w:color="auto" w:val="clear"/>
+            <w:tcMar>
+              <w:top w:type="dxa" w:w="60"/>
+              <w:left w:type="dxa" w:w="90"/>
+              <w:bottom w:type="dxa" w:w="60"/>
+              <w:right w:type="dxa" w:w="90"/>
+            </w:tcMar>
+          </w:tcPr>
+          <w:p>
+            <w:pPr>
+              <w:jc w:val="left"/>
+            </w:pPr>
+            <w:r>
+              <w:rPr>
+                <w:b/>
+                <w:bCs/>
+                <w:sz w:val="17"/>
+                <w:szCs w:val="17"/>
+              </w:rPr>
+              <w:t xml:space="preserve">Espai del Sobre Digital</w:t>
             </w:r>
           </w:p>
         </w:tc>
@@ -640,7 +644,7 @@
         </w:trPr>
         <w:tc>
           <w:tcPr>
-            <w:tcW w:type="dxa" w:w="700"/>
+            <w:tcW w:type="dxa" w:w="600"/>
             <w:tcBorders>
               <w:top w:val="single" w:color="808080" w:sz="4"/>
               <w:left w:val="single" w:color="808080" w:sz="4"/>
@@ -660,8 +664,8 @@
             </w:pPr>
             <w:r>
               <w:rPr>
-                <w:sz w:val="18"/>
-                <w:szCs w:val="18"/>
+                <w:sz w:val="17"/>
+                <w:szCs w:val="17"/>
               </w:rPr>
               <w:t xml:space="preserve">1</w:t>
             </w:r>
@@ -669,35 +673,35 @@
         </w:tc>
         <w:tc>
           <w:tcPr>
-            <w:tcW w:type="dxa" w:w="5170"/>
-            <w:tcBorders>
-              <w:top w:val="single" w:color="808080" w:sz="4"/>
-              <w:left w:val="single" w:color="808080" w:sz="4"/>
-              <w:bottom w:val="single" w:color="808080" w:sz="4"/>
-              <w:right w:val="single" w:color="808080" w:sz="4"/>
-            </w:tcBorders>
-            <w:tcMar>
-              <w:top w:type="dxa" w:w="60"/>
-              <w:left w:type="dxa" w:w="90"/>
-              <w:bottom w:type="dxa" w:w="60"/>
-              <w:right w:type="dxa" w:w="90"/>
-            </w:tcMar>
-          </w:tcPr>
-          <w:p>
-            <w:pPr>
-              <w:jc w:val="left"/>
-            </w:pPr>
-            <w:r>
-              <w:rPr>
-                <w:sz w:val="18"/>
-                <w:szCs w:val="18"/>
+            <w:tcW w:type="dxa" w:w="4300"/>
+            <w:tcBorders>
+              <w:top w:val="single" w:color="808080" w:sz="4"/>
+              <w:left w:val="single" w:color="808080" w:sz="4"/>
+              <w:bottom w:val="single" w:color="808080" w:sz="4"/>
+              <w:right w:val="single" w:color="808080" w:sz="4"/>
+            </w:tcBorders>
+            <w:tcMar>
+              <w:top w:type="dxa" w:w="60"/>
+              <w:left w:type="dxa" w:w="90"/>
+              <w:bottom w:type="dxa" w:w="60"/>
+              <w:right w:type="dxa" w:w="90"/>
+            </w:tcMar>
+          </w:tcPr>
+          <w:p>
+            <w:pPr>
+              <w:jc w:val="left"/>
+            </w:pPr>
+            <w:r>
+              <w:rPr>
+                <w:sz w:val="17"/>
+                <w:szCs w:val="17"/>
               </w:rPr>
               <w:t xml:space="preserve">Certificat de l'entitat asseguradora </w:t>
             </w:r>
             <w:r>
               <w:rPr>
-                <w:sz w:val="18"/>
-                <w:szCs w:val="18"/>
+                <w:sz w:val="17"/>
+                <w:szCs w:val="17"/>
                 <w:highlight w:val="yellow"/>
                 <w:highlightCs w:val="yellow"/>
               </w:rPr>
@@ -705,15 +709,15 @@
             </w:r>
             <w:r>
               <w:rPr>
-                <w:sz w:val="18"/>
-                <w:szCs w:val="18"/>
+                <w:sz w:val="17"/>
+                <w:szCs w:val="17"/>
               </w:rPr>
               <w:t xml:space="preserve"> relatiu a la pòlissa d'assegurança de responsabilitat civil professional núm. </w:t>
             </w:r>
             <w:r>
               <w:rPr>
-                <w:sz w:val="18"/>
-                <w:szCs w:val="18"/>
+                <w:sz w:val="17"/>
+                <w:szCs w:val="17"/>
                 <w:highlight w:val="yellow"/>
                 <w:highlightCs w:val="yellow"/>
               </w:rPr>
@@ -723,30 +727,59 @@
         </w:tc>
         <w:tc>
           <w:tcPr>
-            <w:tcW w:type="dxa" w:w="3200"/>
-            <w:tcBorders>
-              <w:top w:val="single" w:color="808080" w:sz="4"/>
-              <w:left w:val="single" w:color="808080" w:sz="4"/>
-              <w:bottom w:val="single" w:color="808080" w:sz="4"/>
-              <w:right w:val="single" w:color="808080" w:sz="4"/>
-            </w:tcBorders>
-            <w:tcMar>
-              <w:top w:type="dxa" w:w="60"/>
-              <w:left w:type="dxa" w:w="90"/>
-              <w:bottom w:type="dxa" w:w="60"/>
-              <w:right w:type="dxa" w:w="90"/>
-            </w:tcMar>
-          </w:tcPr>
-          <w:p>
-            <w:pPr>
-              <w:jc w:val="left"/>
-            </w:pPr>
-            <w:r>
-              <w:rPr>
-                <w:sz w:val="18"/>
-                <w:szCs w:val="18"/>
+            <w:tcW w:type="dxa" w:w="2370"/>
+            <w:tcBorders>
+              <w:top w:val="single" w:color="808080" w:sz="4"/>
+              <w:left w:val="single" w:color="808080" w:sz="4"/>
+              <w:bottom w:val="single" w:color="808080" w:sz="4"/>
+              <w:right w:val="single" w:color="808080" w:sz="4"/>
+            </w:tcBorders>
+            <w:tcMar>
+              <w:top w:type="dxa" w:w="60"/>
+              <w:left w:type="dxa" w:w="90"/>
+              <w:bottom w:type="dxa" w:w="60"/>
+              <w:right w:type="dxa" w:w="90"/>
+            </w:tcMar>
+          </w:tcPr>
+          <w:p>
+            <w:pPr>
+              <w:jc w:val="left"/>
+            </w:pPr>
+            <w:r>
+              <w:rPr>
+                <w:sz w:val="17"/>
+                <w:szCs w:val="17"/>
               </w:rPr>
               <w:t xml:space="preserve">Solvència econòmica i financera (PCAP, apartat G1)</w:t>
+            </w:r>
+          </w:p>
+        </w:tc>
+        <w:tc>
+          <w:tcPr>
+            <w:tcW w:type="dxa" w:w="1800"/>
+            <w:tcBorders>
+              <w:top w:val="single" w:color="808080" w:sz="4"/>
+              <w:left w:val="single" w:color="808080" w:sz="4"/>
+              <w:bottom w:val="single" w:color="808080" w:sz="4"/>
+              <w:right w:val="single" w:color="808080" w:sz="4"/>
+            </w:tcBorders>
+            <w:tcMar>
+              <w:top w:type="dxa" w:w="60"/>
+              <w:left w:type="dxa" w:w="90"/>
+              <w:bottom w:type="dxa" w:w="60"/>
+              <w:right w:type="dxa" w:w="90"/>
+            </w:tcMar>
+          </w:tcPr>
+          <w:p>
+            <w:pPr>
+              <w:jc w:val="left"/>
+            </w:pPr>
+            <w:r>
+              <w:rPr>
+                <w:sz w:val="17"/>
+                <w:szCs w:val="17"/>
+              </w:rPr>
+              <w:t xml:space="preserve">Solvència econòmica</w:t>
             </w:r>
           </w:p>
         </w:tc>
@@ -758,7 +791,7 @@
         </w:trPr>
         <w:tc>
           <w:tcPr>
-            <w:tcW w:type="dxa" w:w="700"/>
+            <w:tcW w:type="dxa" w:w="600"/>
             <w:tcBorders>
               <w:top w:val="single" w:color="808080" w:sz="4"/>
               <w:left w:val="single" w:color="808080" w:sz="4"/>
@@ -778,8 +811,8 @@
             </w:pPr>
             <w:r>
               <w:rPr>
-                <w:sz w:val="18"/>
-                <w:szCs w:val="18"/>
+                <w:sz w:val="17"/>
+                <w:szCs w:val="17"/>
               </w:rPr>
               <w:t xml:space="preserve">2</w:t>
             </w:r>
@@ -787,28 +820,28 @@
         </w:tc>
         <w:tc>
           <w:tcPr>
-            <w:tcW w:type="dxa" w:w="5170"/>
-            <w:tcBorders>
-              <w:top w:val="single" w:color="808080" w:sz="4"/>
-              <w:left w:val="single" w:color="808080" w:sz="4"/>
-              <w:bottom w:val="single" w:color="808080" w:sz="4"/>
-              <w:right w:val="single" w:color="808080" w:sz="4"/>
-            </w:tcBorders>
-            <w:tcMar>
-              <w:top w:type="dxa" w:w="60"/>
-              <w:left w:type="dxa" w:w="90"/>
-              <w:bottom w:type="dxa" w:w="60"/>
-              <w:right w:type="dxa" w:w="90"/>
-            </w:tcMar>
-          </w:tcPr>
-          <w:p>
-            <w:pPr>
-              <w:jc w:val="left"/>
-            </w:pPr>
-            <w:r>
-              <w:rPr>
-                <w:sz w:val="18"/>
-                <w:szCs w:val="18"/>
+            <w:tcW w:type="dxa" w:w="4300"/>
+            <w:tcBorders>
+              <w:top w:val="single" w:color="808080" w:sz="4"/>
+              <w:left w:val="single" w:color="808080" w:sz="4"/>
+              <w:bottom w:val="single" w:color="808080" w:sz="4"/>
+              <w:right w:val="single" w:color="808080" w:sz="4"/>
+            </w:tcBorders>
+            <w:tcMar>
+              <w:top w:type="dxa" w:w="60"/>
+              <w:left w:type="dxa" w:w="90"/>
+              <w:bottom w:type="dxa" w:w="60"/>
+              <w:right w:type="dxa" w:w="90"/>
+            </w:tcMar>
+          </w:tcPr>
+          <w:p>
+            <w:pPr>
+              <w:jc w:val="left"/>
+            </w:pPr>
+            <w:r>
+              <w:rPr>
+                <w:sz w:val="17"/>
+                <w:szCs w:val="17"/>
               </w:rPr>
               <w:t xml:space="preserve">Declaració responsable de compromís de renovació o pròrroga de l'assegurança</w:t>
             </w:r>
@@ -816,30 +849,59 @@
         </w:tc>
         <w:tc>
           <w:tcPr>
-            <w:tcW w:type="dxa" w:w="3200"/>
-            <w:tcBorders>
-              <w:top w:val="single" w:color="808080" w:sz="4"/>
-              <w:left w:val="single" w:color="808080" w:sz="4"/>
-              <w:bottom w:val="single" w:color="808080" w:sz="4"/>
-              <w:right w:val="single" w:color="808080" w:sz="4"/>
-            </w:tcBorders>
-            <w:tcMar>
-              <w:top w:type="dxa" w:w="60"/>
-              <w:left w:type="dxa" w:w="90"/>
-              <w:bottom w:type="dxa" w:w="60"/>
-              <w:right w:type="dxa" w:w="90"/>
-            </w:tcMar>
-          </w:tcPr>
-          <w:p>
-            <w:pPr>
-              <w:jc w:val="left"/>
-            </w:pPr>
-            <w:r>
-              <w:rPr>
-                <w:sz w:val="18"/>
-                <w:szCs w:val="18"/>
+            <w:tcW w:type="dxa" w:w="2370"/>
+            <w:tcBorders>
+              <w:top w:val="single" w:color="808080" w:sz="4"/>
+              <w:left w:val="single" w:color="808080" w:sz="4"/>
+              <w:bottom w:val="single" w:color="808080" w:sz="4"/>
+              <w:right w:val="single" w:color="808080" w:sz="4"/>
+            </w:tcBorders>
+            <w:tcMar>
+              <w:top w:type="dxa" w:w="60"/>
+              <w:left w:type="dxa" w:w="90"/>
+              <w:bottom w:type="dxa" w:w="60"/>
+              <w:right w:type="dxa" w:w="90"/>
+            </w:tcMar>
+          </w:tcPr>
+          <w:p>
+            <w:pPr>
+              <w:jc w:val="left"/>
+            </w:pPr>
+            <w:r>
+              <w:rPr>
+                <w:sz w:val="17"/>
+                <w:szCs w:val="17"/>
               </w:rPr>
               <w:t xml:space="preserve">Solvència econòmica i financera (PCAP, apartat G1)</w:t>
+            </w:r>
+          </w:p>
+        </w:tc>
+        <w:tc>
+          <w:tcPr>
+            <w:tcW w:type="dxa" w:w="1800"/>
+            <w:tcBorders>
+              <w:top w:val="single" w:color="808080" w:sz="4"/>
+              <w:left w:val="single" w:color="808080" w:sz="4"/>
+              <w:bottom w:val="single" w:color="808080" w:sz="4"/>
+              <w:right w:val="single" w:color="808080" w:sz="4"/>
+            </w:tcBorders>
+            <w:tcMar>
+              <w:top w:type="dxa" w:w="60"/>
+              <w:left w:type="dxa" w:w="90"/>
+              <w:bottom w:type="dxa" w:w="60"/>
+              <w:right w:type="dxa" w:w="90"/>
+            </w:tcMar>
+          </w:tcPr>
+          <w:p>
+            <w:pPr>
+              <w:jc w:val="left"/>
+            </w:pPr>
+            <w:r>
+              <w:rPr>
+                <w:sz w:val="17"/>
+                <w:szCs w:val="17"/>
+              </w:rPr>
+              <w:t xml:space="preserve">Solvència econòmica</w:t>
             </w:r>
           </w:p>
         </w:tc>
@@ -851,7 +913,7 @@
         </w:trPr>
         <w:tc>
           <w:tcPr>
-            <w:tcW w:type="dxa" w:w="700"/>
+            <w:tcW w:type="dxa" w:w="600"/>
             <w:tcBorders>
               <w:top w:val="single" w:color="808080" w:sz="4"/>
               <w:left w:val="single" w:color="808080" w:sz="4"/>
@@ -871,8 +933,8 @@
             </w:pPr>
             <w:r>
               <w:rPr>
-                <w:sz w:val="18"/>
-                <w:szCs w:val="18"/>
+                <w:sz w:val="17"/>
+                <w:szCs w:val="17"/>
               </w:rPr>
               <w:t xml:space="preserve">3</w:t>
             </w:r>
@@ -880,28 +942,28 @@
         </w:tc>
         <w:tc>
           <w:tcPr>
-            <w:tcW w:type="dxa" w:w="5170"/>
-            <w:tcBorders>
-              <w:top w:val="single" w:color="808080" w:sz="4"/>
-              <w:left w:val="single" w:color="808080" w:sz="4"/>
-              <w:bottom w:val="single" w:color="808080" w:sz="4"/>
-              <w:right w:val="single" w:color="808080" w:sz="4"/>
-            </w:tcBorders>
-            <w:tcMar>
-              <w:top w:type="dxa" w:w="60"/>
-              <w:left w:type="dxa" w:w="90"/>
-              <w:bottom w:type="dxa" w:w="60"/>
-              <w:right w:type="dxa" w:w="90"/>
-            </w:tcMar>
-          </w:tcPr>
-          <w:p>
-            <w:pPr>
-              <w:jc w:val="left"/>
-            </w:pPr>
-            <w:r>
-              <w:rPr>
-                <w:sz w:val="18"/>
-                <w:szCs w:val="18"/>
+            <w:tcW w:type="dxa" w:w="4300"/>
+            <w:tcBorders>
+              <w:top w:val="single" w:color="808080" w:sz="4"/>
+              <w:left w:val="single" w:color="808080" w:sz="4"/>
+              <w:bottom w:val="single" w:color="808080" w:sz="4"/>
+              <w:right w:val="single" w:color="808080" w:sz="4"/>
+            </w:tcBorders>
+            <w:tcMar>
+              <w:top w:type="dxa" w:w="60"/>
+              <w:left w:type="dxa" w:w="90"/>
+              <w:bottom w:type="dxa" w:w="60"/>
+              <w:right w:type="dxa" w:w="90"/>
+            </w:tcMar>
+          </w:tcPr>
+          <w:p>
+            <w:pPr>
+              <w:jc w:val="left"/>
+            </w:pPr>
+            <w:r>
+              <w:rPr>
+                <w:sz w:val="17"/>
+                <w:szCs w:val="17"/>
               </w:rPr>
               <w:t xml:space="preserve">Relació nominal de l'equip docent adscrit a l'execució de l'Acord marc (17 docents), amb indicació del sexe, l'experiència i el tipus de vinculació</w:t>
             </w:r>
@@ -909,30 +971,59 @@
         </w:tc>
         <w:tc>
           <w:tcPr>
-            <w:tcW w:type="dxa" w:w="3200"/>
-            <w:tcBorders>
-              <w:top w:val="single" w:color="808080" w:sz="4"/>
-              <w:left w:val="single" w:color="808080" w:sz="4"/>
-              <w:bottom w:val="single" w:color="808080" w:sz="4"/>
-              <w:right w:val="single" w:color="808080" w:sz="4"/>
-            </w:tcBorders>
-            <w:tcMar>
-              <w:top w:type="dxa" w:w="60"/>
-              <w:left w:type="dxa" w:w="90"/>
-              <w:bottom w:type="dxa" w:w="60"/>
-              <w:right w:type="dxa" w:w="90"/>
-            </w:tcMar>
-          </w:tcPr>
-          <w:p>
-            <w:pPr>
-              <w:jc w:val="left"/>
-            </w:pPr>
-            <w:r>
-              <w:rPr>
-                <w:sz w:val="18"/>
-                <w:szCs w:val="18"/>
+            <w:tcW w:type="dxa" w:w="2370"/>
+            <w:tcBorders>
+              <w:top w:val="single" w:color="808080" w:sz="4"/>
+              <w:left w:val="single" w:color="808080" w:sz="4"/>
+              <w:bottom w:val="single" w:color="808080" w:sz="4"/>
+              <w:right w:val="single" w:color="808080" w:sz="4"/>
+            </w:tcBorders>
+            <w:tcMar>
+              <w:top w:type="dxa" w:w="60"/>
+              <w:left w:type="dxa" w:w="90"/>
+              <w:bottom w:type="dxa" w:w="60"/>
+              <w:right w:type="dxa" w:w="90"/>
+            </w:tcMar>
+          </w:tcPr>
+          <w:p>
+            <w:pPr>
+              <w:jc w:val="left"/>
+            </w:pPr>
+            <w:r>
+              <w:rPr>
+                <w:sz w:val="17"/>
+                <w:szCs w:val="17"/>
               </w:rPr>
               <w:t xml:space="preserve">Solvència tècnica (G2), adscripció de mitjans (G4) i compromís del sobre C</w:t>
+            </w:r>
+          </w:p>
+        </w:tc>
+        <w:tc>
+          <w:tcPr>
+            <w:tcW w:type="dxa" w:w="1800"/>
+            <w:tcBorders>
+              <w:top w:val="single" w:color="808080" w:sz="4"/>
+              <w:left w:val="single" w:color="808080" w:sz="4"/>
+              <w:bottom w:val="single" w:color="808080" w:sz="4"/>
+              <w:right w:val="single" w:color="808080" w:sz="4"/>
+            </w:tcBorders>
+            <w:tcMar>
+              <w:top w:type="dxa" w:w="60"/>
+              <w:left w:type="dxa" w:w="90"/>
+              <w:bottom w:type="dxa" w:w="60"/>
+              <w:right w:type="dxa" w:w="90"/>
+            </w:tcMar>
+          </w:tcPr>
+          <w:p>
+            <w:pPr>
+              <w:jc w:val="left"/>
+            </w:pPr>
+            <w:r>
+              <w:rPr>
+                <w:sz w:val="17"/>
+                <w:szCs w:val="17"/>
+              </w:rPr>
+              <w:t xml:space="preserve">Solvència tècnica i Disposició de mitjans</w:t>
             </w:r>
           </w:p>
         </w:tc>
@@ -944,7 +1035,7 @@
         </w:trPr>
         <w:tc>
           <w:tcPr>
-            <w:tcW w:type="dxa" w:w="700"/>
+            <w:tcW w:type="dxa" w:w="600"/>
             <w:tcBorders>
               <w:top w:val="single" w:color="808080" w:sz="4"/>
               <w:left w:val="single" w:color="808080" w:sz="4"/>
@@ -964,8 +1055,8 @@
             </w:pPr>
             <w:r>
               <w:rPr>
-                <w:sz w:val="18"/>
-                <w:szCs w:val="18"/>
+                <w:sz w:val="17"/>
+                <w:szCs w:val="17"/>
               </w:rPr>
               <w:t xml:space="preserve">4</w:t>
             </w:r>
@@ -973,35 +1064,35 @@
         </w:tc>
         <w:tc>
           <w:tcPr>
-            <w:tcW w:type="dxa" w:w="5170"/>
-            <w:tcBorders>
-              <w:top w:val="single" w:color="808080" w:sz="4"/>
-              <w:left w:val="single" w:color="808080" w:sz="4"/>
-              <w:bottom w:val="single" w:color="808080" w:sz="4"/>
-              <w:right w:val="single" w:color="808080" w:sz="4"/>
-            </w:tcBorders>
-            <w:tcMar>
-              <w:top w:type="dxa" w:w="60"/>
-              <w:left w:type="dxa" w:w="90"/>
-              <w:bottom w:type="dxa" w:w="60"/>
-              <w:right w:type="dxa" w:w="90"/>
-            </w:tcMar>
-          </w:tcPr>
-          <w:p>
-            <w:pPr>
-              <w:jc w:val="left"/>
-            </w:pPr>
-            <w:r>
-              <w:rPr>
-                <w:sz w:val="18"/>
-                <w:szCs w:val="18"/>
+            <w:tcW w:type="dxa" w:w="4300"/>
+            <w:tcBorders>
+              <w:top w:val="single" w:color="808080" w:sz="4"/>
+              <w:left w:val="single" w:color="808080" w:sz="4"/>
+              <w:bottom w:val="single" w:color="808080" w:sz="4"/>
+              <w:right w:val="single" w:color="808080" w:sz="4"/>
+            </w:tcBorders>
+            <w:tcMar>
+              <w:top w:type="dxa" w:w="60"/>
+              <w:left w:type="dxa" w:w="90"/>
+              <w:bottom w:type="dxa" w:w="60"/>
+              <w:right w:type="dxa" w:w="90"/>
+            </w:tcMar>
+          </w:tcPr>
+          <w:p>
+            <w:pPr>
+              <w:jc w:val="left"/>
+            </w:pPr>
+            <w:r>
+              <w:rPr>
+                <w:sz w:val="17"/>
+                <w:szCs w:val="17"/>
               </w:rPr>
               <w:t xml:space="preserve">Relació nominal de treballadors (RNT) de la Tresoreria General de la Seguretat Social, període de liquidació </w:t>
             </w:r>
             <w:r>
               <w:rPr>
-                <w:sz w:val="18"/>
-                <w:szCs w:val="18"/>
+                <w:sz w:val="17"/>
+                <w:szCs w:val="17"/>
                 <w:highlight w:val="yellow"/>
                 <w:highlightCs w:val="yellow"/>
               </w:rPr>
@@ -1011,30 +1102,59 @@
         </w:tc>
         <w:tc>
           <w:tcPr>
-            <w:tcW w:type="dxa" w:w="3200"/>
-            <w:tcBorders>
-              <w:top w:val="single" w:color="808080" w:sz="4"/>
-              <w:left w:val="single" w:color="808080" w:sz="4"/>
-              <w:bottom w:val="single" w:color="808080" w:sz="4"/>
-              <w:right w:val="single" w:color="808080" w:sz="4"/>
-            </w:tcBorders>
-            <w:tcMar>
-              <w:top w:type="dxa" w:w="60"/>
-              <w:left w:type="dxa" w:w="90"/>
-              <w:bottom w:type="dxa" w:w="60"/>
-              <w:right w:type="dxa" w:w="90"/>
-            </w:tcMar>
-          </w:tcPr>
-          <w:p>
-            <w:pPr>
-              <w:jc w:val="left"/>
-            </w:pPr>
-            <w:r>
-              <w:rPr>
-                <w:sz w:val="18"/>
-                <w:szCs w:val="18"/>
+            <w:tcW w:type="dxa" w:w="2370"/>
+            <w:tcBorders>
+              <w:top w:val="single" w:color="808080" w:sz="4"/>
+              <w:left w:val="single" w:color="808080" w:sz="4"/>
+              <w:bottom w:val="single" w:color="808080" w:sz="4"/>
+              <w:right w:val="single" w:color="808080" w:sz="4"/>
+            </w:tcBorders>
+            <w:tcMar>
+              <w:top w:type="dxa" w:w="60"/>
+              <w:left w:type="dxa" w:w="90"/>
+              <w:bottom w:type="dxa" w:w="60"/>
+              <w:right w:type="dxa" w:w="90"/>
+            </w:tcMar>
+          </w:tcPr>
+          <w:p>
+            <w:pPr>
+              <w:jc w:val="left"/>
+            </w:pPr>
+            <w:r>
+              <w:rPr>
+                <w:sz w:val="17"/>
+                <w:szCs w:val="17"/>
               </w:rPr>
               <w:t xml:space="preserve">Personal en plantilla (G2 i G4)</w:t>
+            </w:r>
+          </w:p>
+        </w:tc>
+        <w:tc>
+          <w:tcPr>
+            <w:tcW w:type="dxa" w:w="1800"/>
+            <w:tcBorders>
+              <w:top w:val="single" w:color="808080" w:sz="4"/>
+              <w:left w:val="single" w:color="808080" w:sz="4"/>
+              <w:bottom w:val="single" w:color="808080" w:sz="4"/>
+              <w:right w:val="single" w:color="808080" w:sz="4"/>
+            </w:tcBorders>
+            <w:tcMar>
+              <w:top w:type="dxa" w:w="60"/>
+              <w:left w:type="dxa" w:w="90"/>
+              <w:bottom w:type="dxa" w:w="60"/>
+              <w:right w:type="dxa" w:w="90"/>
+            </w:tcMar>
+          </w:tcPr>
+          <w:p>
+            <w:pPr>
+              <w:jc w:val="left"/>
+            </w:pPr>
+            <w:r>
+              <w:rPr>
+                <w:sz w:val="17"/>
+                <w:szCs w:val="17"/>
+              </w:rPr>
+              <w:t xml:space="preserve">Solvència tècnica i Disposició de mitjans</w:t>
             </w:r>
           </w:p>
         </w:tc>
@@ -1046,7 +1166,7 @@
         </w:trPr>
         <w:tc>
           <w:tcPr>
-            <w:tcW w:type="dxa" w:w="700"/>
+            <w:tcW w:type="dxa" w:w="600"/>
             <w:tcBorders>
               <w:top w:val="single" w:color="808080" w:sz="4"/>
               <w:left w:val="single" w:color="808080" w:sz="4"/>
@@ -1066,8 +1186,8 @@
             </w:pPr>
             <w:r>
               <w:rPr>
-                <w:sz w:val="18"/>
-                <w:szCs w:val="18"/>
+                <w:sz w:val="17"/>
+                <w:szCs w:val="17"/>
               </w:rPr>
               <w:t xml:space="preserve">5</w:t>
             </w:r>
@@ -1075,59 +1195,88 @@
         </w:tc>
         <w:tc>
           <w:tcPr>
-            <w:tcW w:type="dxa" w:w="5170"/>
-            <w:tcBorders>
-              <w:top w:val="single" w:color="808080" w:sz="4"/>
-              <w:left w:val="single" w:color="808080" w:sz="4"/>
-              <w:bottom w:val="single" w:color="808080" w:sz="4"/>
-              <w:right w:val="single" w:color="808080" w:sz="4"/>
-            </w:tcBorders>
-            <w:tcMar>
-              <w:top w:type="dxa" w:w="60"/>
-              <w:left w:type="dxa" w:w="90"/>
-              <w:bottom w:type="dxa" w:w="60"/>
-              <w:right w:type="dxa" w:w="90"/>
-            </w:tcMar>
-          </w:tcPr>
-          <w:p>
-            <w:pPr>
-              <w:jc w:val="left"/>
-            </w:pPr>
-            <w:r>
-              <w:rPr>
-                <w:sz w:val="18"/>
-                <w:szCs w:val="18"/>
-              </w:rPr>
-              <w:t xml:space="preserve">Currículums de les 17 persones docents</w:t>
-            </w:r>
-          </w:p>
-        </w:tc>
-        <w:tc>
-          <w:tcPr>
-            <w:tcW w:type="dxa" w:w="3200"/>
-            <w:tcBorders>
-              <w:top w:val="single" w:color="808080" w:sz="4"/>
-              <w:left w:val="single" w:color="808080" w:sz="4"/>
-              <w:bottom w:val="single" w:color="808080" w:sz="4"/>
-              <w:right w:val="single" w:color="808080" w:sz="4"/>
-            </w:tcBorders>
-            <w:tcMar>
-              <w:top w:type="dxa" w:w="60"/>
-              <w:left w:type="dxa" w:w="90"/>
-              <w:bottom w:type="dxa" w:w="60"/>
-              <w:right w:type="dxa" w:w="90"/>
-            </w:tcMar>
-          </w:tcPr>
-          <w:p>
-            <w:pPr>
-              <w:jc w:val="left"/>
-            </w:pPr>
-            <w:r>
-              <w:rPr>
-                <w:sz w:val="18"/>
-                <w:szCs w:val="18"/>
+            <w:tcW w:type="dxa" w:w="4300"/>
+            <w:tcBorders>
+              <w:top w:val="single" w:color="808080" w:sz="4"/>
+              <w:left w:val="single" w:color="808080" w:sz="4"/>
+              <w:bottom w:val="single" w:color="808080" w:sz="4"/>
+              <w:right w:val="single" w:color="808080" w:sz="4"/>
+            </w:tcBorders>
+            <w:tcMar>
+              <w:top w:type="dxa" w:w="60"/>
+              <w:left w:type="dxa" w:w="90"/>
+              <w:bottom w:type="dxa" w:w="60"/>
+              <w:right w:type="dxa" w:w="90"/>
+            </w:tcMar>
+          </w:tcPr>
+          <w:p>
+            <w:pPr>
+              <w:jc w:val="left"/>
+            </w:pPr>
+            <w:r>
+              <w:rPr>
+                <w:sz w:val="17"/>
+                <w:szCs w:val="17"/>
+              </w:rPr>
+              <w:t xml:space="preserve">Currículums de les 17 persones docents (a l'espai de solvència tècnica, els dels docents que acrediten la solvència)</w:t>
+            </w:r>
+          </w:p>
+        </w:tc>
+        <w:tc>
+          <w:tcPr>
+            <w:tcW w:type="dxa" w:w="2370"/>
+            <w:tcBorders>
+              <w:top w:val="single" w:color="808080" w:sz="4"/>
+              <w:left w:val="single" w:color="808080" w:sz="4"/>
+              <w:bottom w:val="single" w:color="808080" w:sz="4"/>
+              <w:right w:val="single" w:color="808080" w:sz="4"/>
+            </w:tcBorders>
+            <w:tcMar>
+              <w:top w:type="dxa" w:w="60"/>
+              <w:left w:type="dxa" w:w="90"/>
+              <w:bottom w:type="dxa" w:w="60"/>
+              <w:right w:type="dxa" w:w="90"/>
+            </w:tcMar>
+          </w:tcPr>
+          <w:p>
+            <w:pPr>
+              <w:jc w:val="left"/>
+            </w:pPr>
+            <w:r>
+              <w:rPr>
+                <w:sz w:val="17"/>
+                <w:szCs w:val="17"/>
               </w:rPr>
               <w:t xml:space="preserve">Experiència mínima de 5 anys en formació TIC (G2)</w:t>
+            </w:r>
+          </w:p>
+        </w:tc>
+        <w:tc>
+          <w:tcPr>
+            <w:tcW w:type="dxa" w:w="1800"/>
+            <w:tcBorders>
+              <w:top w:val="single" w:color="808080" w:sz="4"/>
+              <w:left w:val="single" w:color="808080" w:sz="4"/>
+              <w:bottom w:val="single" w:color="808080" w:sz="4"/>
+              <w:right w:val="single" w:color="808080" w:sz="4"/>
+            </w:tcBorders>
+            <w:tcMar>
+              <w:top w:type="dxa" w:w="60"/>
+              <w:left w:type="dxa" w:w="90"/>
+              <w:bottom w:type="dxa" w:w="60"/>
+              <w:right w:type="dxa" w:w="90"/>
+            </w:tcMar>
+          </w:tcPr>
+          <w:p>
+            <w:pPr>
+              <w:jc w:val="left"/>
+            </w:pPr>
+            <w:r>
+              <w:rPr>
+                <w:sz w:val="17"/>
+                <w:szCs w:val="17"/>
+              </w:rPr>
+              <w:t xml:space="preserve">Solvència tècnica i Disposició de mitjans</w:t>
             </w:r>
           </w:p>
         </w:tc>
@@ -1139,7 +1288,7 @@
         </w:trPr>
         <w:tc>
           <w:tcPr>
-            <w:tcW w:type="dxa" w:w="700"/>
+            <w:tcW w:type="dxa" w:w="600"/>
             <w:tcBorders>
               <w:top w:val="single" w:color="808080" w:sz="4"/>
               <w:left w:val="single" w:color="808080" w:sz="4"/>
@@ -1159,8 +1308,8 @@
             </w:pPr>
             <w:r>
               <w:rPr>
-                <w:sz w:val="18"/>
-                <w:szCs w:val="18"/>
+                <w:sz w:val="17"/>
+                <w:szCs w:val="17"/>
               </w:rPr>
               <w:t xml:space="preserve">6</w:t>
             </w:r>
@@ -1168,28 +1317,28 @@
         </w:tc>
         <w:tc>
           <w:tcPr>
-            <w:tcW w:type="dxa" w:w="5170"/>
-            <w:tcBorders>
-              <w:top w:val="single" w:color="808080" w:sz="4"/>
-              <w:left w:val="single" w:color="808080" w:sz="4"/>
-              <w:bottom w:val="single" w:color="808080" w:sz="4"/>
-              <w:right w:val="single" w:color="808080" w:sz="4"/>
-            </w:tcBorders>
-            <w:tcMar>
-              <w:top w:type="dxa" w:w="60"/>
-              <w:left w:type="dxa" w:w="90"/>
-              <w:bottom w:type="dxa" w:w="60"/>
-              <w:right w:type="dxa" w:w="90"/>
-            </w:tcMar>
-          </w:tcPr>
-          <w:p>
-            <w:pPr>
-              <w:jc w:val="left"/>
-            </w:pPr>
-            <w:r>
-              <w:rPr>
-                <w:sz w:val="18"/>
-                <w:szCs w:val="18"/>
+            <w:tcW w:type="dxa" w:w="4300"/>
+            <w:tcBorders>
+              <w:top w:val="single" w:color="808080" w:sz="4"/>
+              <w:left w:val="single" w:color="808080" w:sz="4"/>
+              <w:bottom w:val="single" w:color="808080" w:sz="4"/>
+              <w:right w:val="single" w:color="808080" w:sz="4"/>
+            </w:tcBorders>
+            <w:tcMar>
+              <w:top w:type="dxa" w:w="60"/>
+              <w:left w:type="dxa" w:w="90"/>
+              <w:bottom w:type="dxa" w:w="60"/>
+              <w:right w:type="dxa" w:w="90"/>
+            </w:tcMar>
+          </w:tcPr>
+          <w:p>
+            <w:pPr>
+              <w:jc w:val="left"/>
+            </w:pPr>
+            <w:r>
+              <w:rPr>
+                <w:sz w:val="17"/>
+                <w:szCs w:val="17"/>
               </w:rPr>
               <w:t xml:space="preserve">Convenis de col·laboració docent i compromisos individuals de disposició i adscripció subscrits amb cada docent no inclòs a la RNT</w:t>
             </w:r>
@@ -1197,30 +1346,59 @@
         </w:tc>
         <w:tc>
           <w:tcPr>
-            <w:tcW w:type="dxa" w:w="3200"/>
-            <w:tcBorders>
-              <w:top w:val="single" w:color="808080" w:sz="4"/>
-              <w:left w:val="single" w:color="808080" w:sz="4"/>
-              <w:bottom w:val="single" w:color="808080" w:sz="4"/>
-              <w:right w:val="single" w:color="808080" w:sz="4"/>
-            </w:tcBorders>
-            <w:tcMar>
-              <w:top w:type="dxa" w:w="60"/>
-              <w:left w:type="dxa" w:w="90"/>
-              <w:bottom w:type="dxa" w:w="60"/>
-              <w:right w:type="dxa" w:w="90"/>
-            </w:tcMar>
-          </w:tcPr>
-          <w:p>
-            <w:pPr>
-              <w:jc w:val="left"/>
-            </w:pPr>
-            <w:r>
-              <w:rPr>
-                <w:sz w:val="18"/>
-                <w:szCs w:val="18"/>
+            <w:tcW w:type="dxa" w:w="2370"/>
+            <w:tcBorders>
+              <w:top w:val="single" w:color="808080" w:sz="4"/>
+              <w:left w:val="single" w:color="808080" w:sz="4"/>
+              <w:bottom w:val="single" w:color="808080" w:sz="4"/>
+              <w:right w:val="single" w:color="808080" w:sz="4"/>
+            </w:tcBorders>
+            <w:tcMar>
+              <w:top w:type="dxa" w:w="60"/>
+              <w:left w:type="dxa" w:w="90"/>
+              <w:bottom w:type="dxa" w:w="60"/>
+              <w:right w:type="dxa" w:w="90"/>
+            </w:tcMar>
+          </w:tcPr>
+          <w:p>
+            <w:pPr>
+              <w:jc w:val="left"/>
+            </w:pPr>
+            <w:r>
+              <w:rPr>
+                <w:sz w:val="17"/>
+                <w:szCs w:val="17"/>
               </w:rPr>
               <w:t xml:space="preserve">Disposició efectiva de mitjans (arts. 76.2 i 150.2 LCSP) i, si escau, compromís de l'art. 75.2 LCSP</w:t>
+            </w:r>
+          </w:p>
+        </w:tc>
+        <w:tc>
+          <w:tcPr>
+            <w:tcW w:type="dxa" w:w="1800"/>
+            <w:tcBorders>
+              <w:top w:val="single" w:color="808080" w:sz="4"/>
+              <w:left w:val="single" w:color="808080" w:sz="4"/>
+              <w:bottom w:val="single" w:color="808080" w:sz="4"/>
+              <w:right w:val="single" w:color="808080" w:sz="4"/>
+            </w:tcBorders>
+            <w:tcMar>
+              <w:top w:type="dxa" w:w="60"/>
+              <w:left w:type="dxa" w:w="90"/>
+              <w:bottom w:type="dxa" w:w="60"/>
+              <w:right w:type="dxa" w:w="90"/>
+            </w:tcMar>
+          </w:tcPr>
+          <w:p>
+            <w:pPr>
+              <w:jc w:val="left"/>
+            </w:pPr>
+            <w:r>
+              <w:rPr>
+                <w:sz w:val="17"/>
+                <w:szCs w:val="17"/>
+              </w:rPr>
+              <w:t xml:space="preserve">Solvència tècnica i Disposició de mitjans</w:t>
             </w:r>
           </w:p>
         </w:tc>
@@ -1232,7 +1410,7 @@
         </w:trPr>
         <w:tc>
           <w:tcPr>
-            <w:tcW w:type="dxa" w:w="700"/>
+            <w:tcW w:type="dxa" w:w="600"/>
             <w:tcBorders>
               <w:top w:val="single" w:color="808080" w:sz="4"/>
               <w:left w:val="single" w:color="808080" w:sz="4"/>
@@ -1252,8 +1430,8 @@
             </w:pPr>
             <w:r>
               <w:rPr>
-                <w:sz w:val="18"/>
-                <w:szCs w:val="18"/>
+                <w:sz w:val="17"/>
+                <w:szCs w:val="17"/>
               </w:rPr>
               <w:t xml:space="preserve">7</w:t>
             </w:r>
@@ -1261,28 +1439,28 @@
         </w:tc>
         <w:tc>
           <w:tcPr>
-            <w:tcW w:type="dxa" w:w="5170"/>
-            <w:tcBorders>
-              <w:top w:val="single" w:color="808080" w:sz="4"/>
-              <w:left w:val="single" w:color="808080" w:sz="4"/>
-              <w:bottom w:val="single" w:color="808080" w:sz="4"/>
-              <w:right w:val="single" w:color="808080" w:sz="4"/>
-            </w:tcBorders>
-            <w:tcMar>
-              <w:top w:type="dxa" w:w="60"/>
-              <w:left w:type="dxa" w:w="90"/>
-              <w:bottom w:type="dxa" w:w="60"/>
-              <w:right w:type="dxa" w:w="90"/>
-            </w:tcMar>
-          </w:tcPr>
-          <w:p>
-            <w:pPr>
-              <w:jc w:val="left"/>
-            </w:pPr>
-            <w:r>
-              <w:rPr>
-                <w:sz w:val="18"/>
-                <w:szCs w:val="18"/>
+            <w:tcW w:type="dxa" w:w="4300"/>
+            <w:tcBorders>
+              <w:top w:val="single" w:color="808080" w:sz="4"/>
+              <w:left w:val="single" w:color="808080" w:sz="4"/>
+              <w:bottom w:val="single" w:color="808080" w:sz="4"/>
+              <w:right w:val="single" w:color="808080" w:sz="4"/>
+            </w:tcBorders>
+            <w:tcMar>
+              <w:top w:type="dxa" w:w="60"/>
+              <w:left w:type="dxa" w:w="90"/>
+              <w:bottom w:type="dxa" w:w="60"/>
+              <w:right w:type="dxa" w:w="90"/>
+            </w:tcMar>
+          </w:tcPr>
+          <w:p>
+            <w:pPr>
+              <w:jc w:val="left"/>
+            </w:pPr>
+            <w:r>
+              <w:rPr>
+                <w:sz w:val="17"/>
+                <w:szCs w:val="17"/>
                 <w:highlight w:val="yellow"/>
                 <w:highlightCs w:val="yellow"/>
               </w:rPr>
@@ -1292,30 +1470,59 @@
         </w:tc>
         <w:tc>
           <w:tcPr>
-            <w:tcW w:type="dxa" w:w="3200"/>
-            <w:tcBorders>
-              <w:top w:val="single" w:color="808080" w:sz="4"/>
-              <w:left w:val="single" w:color="808080" w:sz="4"/>
-              <w:bottom w:val="single" w:color="808080" w:sz="4"/>
-              <w:right w:val="single" w:color="808080" w:sz="4"/>
-            </w:tcBorders>
-            <w:tcMar>
-              <w:top w:type="dxa" w:w="60"/>
-              <w:left w:type="dxa" w:w="90"/>
-              <w:bottom w:type="dxa" w:w="60"/>
-              <w:right w:type="dxa" w:w="90"/>
-            </w:tcMar>
-          </w:tcPr>
-          <w:p>
-            <w:pPr>
-              <w:jc w:val="left"/>
-            </w:pPr>
-            <w:r>
-              <w:rPr>
-                <w:sz w:val="18"/>
-                <w:szCs w:val="18"/>
+            <w:tcW w:type="dxa" w:w="2370"/>
+            <w:tcBorders>
+              <w:top w:val="single" w:color="808080" w:sz="4"/>
+              <w:left w:val="single" w:color="808080" w:sz="4"/>
+              <w:bottom w:val="single" w:color="808080" w:sz="4"/>
+              <w:right w:val="single" w:color="808080" w:sz="4"/>
+            </w:tcBorders>
+            <w:tcMar>
+              <w:top w:type="dxa" w:w="60"/>
+              <w:left w:type="dxa" w:w="90"/>
+              <w:bottom w:type="dxa" w:w="60"/>
+              <w:right w:type="dxa" w:w="90"/>
+            </w:tcMar>
+          </w:tcPr>
+          <w:p>
+            <w:pPr>
+              <w:jc w:val="left"/>
+            </w:pPr>
+            <w:r>
+              <w:rPr>
+                <w:sz w:val="17"/>
+                <w:szCs w:val="17"/>
               </w:rPr>
               <w:t xml:space="preserve">Disponibilitat dels mitjans a la data final de presentació d'ofertes (clàusula 9.1 PCAP)</w:t>
+            </w:r>
+          </w:p>
+        </w:tc>
+        <w:tc>
+          <w:tcPr>
+            <w:tcW w:type="dxa" w:w="1800"/>
+            <w:tcBorders>
+              <w:top w:val="single" w:color="808080" w:sz="4"/>
+              <w:left w:val="single" w:color="808080" w:sz="4"/>
+              <w:bottom w:val="single" w:color="808080" w:sz="4"/>
+              <w:right w:val="single" w:color="808080" w:sz="4"/>
+            </w:tcBorders>
+            <w:tcMar>
+              <w:top w:type="dxa" w:w="60"/>
+              <w:left w:type="dxa" w:w="90"/>
+              <w:bottom w:type="dxa" w:w="60"/>
+              <w:right w:type="dxa" w:w="90"/>
+            </w:tcMar>
+          </w:tcPr>
+          <w:p>
+            <w:pPr>
+              <w:jc w:val="left"/>
+            </w:pPr>
+            <w:r>
+              <w:rPr>
+                <w:sz w:val="17"/>
+                <w:szCs w:val="17"/>
+              </w:rPr>
+              <w:t xml:space="preserve">Solvència tècnica</w:t>
             </w:r>
           </w:p>
         </w:tc>
@@ -1327,7 +1534,7 @@
         </w:trPr>
         <w:tc>
           <w:tcPr>
-            <w:tcW w:type="dxa" w:w="700"/>
+            <w:tcW w:type="dxa" w:w="600"/>
             <w:tcBorders>
               <w:top w:val="single" w:color="808080" w:sz="4"/>
               <w:left w:val="single" w:color="808080" w:sz="4"/>
@@ -1347,8 +1554,8 @@
             </w:pPr>
             <w:r>
               <w:rPr>
-                <w:sz w:val="18"/>
-                <w:szCs w:val="18"/>
+                <w:sz w:val="17"/>
+                <w:szCs w:val="17"/>
               </w:rPr>
               <w:t xml:space="preserve">8</w:t>
             </w:r>
@@ -1356,35 +1563,35 @@
         </w:tc>
         <w:tc>
           <w:tcPr>
-            <w:tcW w:type="dxa" w:w="5170"/>
-            <w:tcBorders>
-              <w:top w:val="single" w:color="808080" w:sz="4"/>
-              <w:left w:val="single" w:color="808080" w:sz="4"/>
-              <w:bottom w:val="single" w:color="808080" w:sz="4"/>
-              <w:right w:val="single" w:color="808080" w:sz="4"/>
-            </w:tcBorders>
-            <w:tcMar>
-              <w:top w:type="dxa" w:w="60"/>
-              <w:left w:type="dxa" w:w="90"/>
-              <w:bottom w:type="dxa" w:w="60"/>
-              <w:right w:type="dxa" w:w="90"/>
-            </w:tcMar>
-          </w:tcPr>
-          <w:p>
-            <w:pPr>
-              <w:jc w:val="left"/>
-            </w:pPr>
-            <w:r>
-              <w:rPr>
-                <w:sz w:val="18"/>
-                <w:szCs w:val="18"/>
+            <w:tcW w:type="dxa" w:w="4300"/>
+            <w:tcBorders>
+              <w:top w:val="single" w:color="808080" w:sz="4"/>
+              <w:left w:val="single" w:color="808080" w:sz="4"/>
+              <w:bottom w:val="single" w:color="808080" w:sz="4"/>
+              <w:right w:val="single" w:color="808080" w:sz="4"/>
+            </w:tcBorders>
+            <w:tcMar>
+              <w:top w:type="dxa" w:w="60"/>
+              <w:left w:type="dxa" w:w="90"/>
+              <w:bottom w:type="dxa" w:w="60"/>
+              <w:right w:type="dxa" w:w="90"/>
+            </w:tcMar>
+          </w:tcPr>
+          <w:p>
+            <w:pPr>
+              <w:jc w:val="left"/>
+            </w:pPr>
+            <w:r>
+              <w:rPr>
+                <w:sz w:val="17"/>
+                <w:szCs w:val="17"/>
               </w:rPr>
               <w:t xml:space="preserve">Títol oficial de </w:t>
             </w:r>
             <w:r>
               <w:rPr>
-                <w:sz w:val="18"/>
-                <w:szCs w:val="18"/>
+                <w:sz w:val="17"/>
+                <w:szCs w:val="17"/>
                 <w:highlight w:val="yellow"/>
                 <w:highlightCs w:val="yellow"/>
               </w:rPr>
@@ -1392,15 +1599,15 @@
             </w:r>
             <w:r>
               <w:rPr>
-                <w:sz w:val="18"/>
-                <w:szCs w:val="18"/>
+                <w:sz w:val="17"/>
+                <w:szCs w:val="17"/>
               </w:rPr>
               <w:t xml:space="preserve"> de </w:t>
             </w:r>
             <w:r>
               <w:rPr>
-                <w:sz w:val="18"/>
-                <w:szCs w:val="18"/>
+                <w:sz w:val="17"/>
+                <w:szCs w:val="17"/>
                 <w:highlight w:val="yellow"/>
                 <w:highlightCs w:val="yellow"/>
               </w:rPr>
@@ -1410,30 +1617,59 @@
         </w:tc>
         <w:tc>
           <w:tcPr>
-            <w:tcW w:type="dxa" w:w="3200"/>
-            <w:tcBorders>
-              <w:top w:val="single" w:color="808080" w:sz="4"/>
-              <w:left w:val="single" w:color="808080" w:sz="4"/>
-              <w:bottom w:val="single" w:color="808080" w:sz="4"/>
-              <w:right w:val="single" w:color="808080" w:sz="4"/>
-            </w:tcBorders>
-            <w:tcMar>
-              <w:top w:type="dxa" w:w="60"/>
-              <w:left w:type="dxa" w:w="90"/>
-              <w:bottom w:type="dxa" w:w="60"/>
-              <w:right w:type="dxa" w:w="90"/>
-            </w:tcMar>
-          </w:tcPr>
-          <w:p>
-            <w:pPr>
-              <w:jc w:val="left"/>
-            </w:pPr>
-            <w:r>
-              <w:rPr>
-                <w:sz w:val="18"/>
-                <w:szCs w:val="18"/>
+            <w:tcW w:type="dxa" w:w="2370"/>
+            <w:tcBorders>
+              <w:top w:val="single" w:color="808080" w:sz="4"/>
+              <w:left w:val="single" w:color="808080" w:sz="4"/>
+              <w:bottom w:val="single" w:color="808080" w:sz="4"/>
+              <w:right w:val="single" w:color="808080" w:sz="4"/>
+            </w:tcBorders>
+            <w:tcMar>
+              <w:top w:type="dxa" w:w="60"/>
+              <w:left w:type="dxa" w:w="90"/>
+              <w:bottom w:type="dxa" w:w="60"/>
+              <w:right w:type="dxa" w:w="90"/>
+            </w:tcMar>
+          </w:tcPr>
+          <w:p>
+            <w:pPr>
+              <w:jc w:val="left"/>
+            </w:pPr>
+            <w:r>
+              <w:rPr>
+                <w:sz w:val="17"/>
+                <w:szCs w:val="17"/>
               </w:rPr>
               <w:t xml:space="preserve">Solvència tècnica addicional (PCAP, apartat G4)</w:t>
+            </w:r>
+          </w:p>
+        </w:tc>
+        <w:tc>
+          <w:tcPr>
+            <w:tcW w:type="dxa" w:w="1800"/>
+            <w:tcBorders>
+              <w:top w:val="single" w:color="808080" w:sz="4"/>
+              <w:left w:val="single" w:color="808080" w:sz="4"/>
+              <w:bottom w:val="single" w:color="808080" w:sz="4"/>
+              <w:right w:val="single" w:color="808080" w:sz="4"/>
+            </w:tcBorders>
+            <w:tcMar>
+              <w:top w:type="dxa" w:w="60"/>
+              <w:left w:type="dxa" w:w="90"/>
+              <w:bottom w:type="dxa" w:w="60"/>
+              <w:right w:type="dxa" w:w="90"/>
+            </w:tcMar>
+          </w:tcPr>
+          <w:p>
+            <w:pPr>
+              <w:jc w:val="left"/>
+            </w:pPr>
+            <w:r>
+              <w:rPr>
+                <w:sz w:val="17"/>
+                <w:szCs w:val="17"/>
+              </w:rPr>
+              <w:t xml:space="preserve">Disposició de mitjans</w:t>
             </w:r>
           </w:p>
         </w:tc>
@@ -1481,7 +1717,7 @@
           <w:highlight w:val="yellow"/>
           <w:highlightCs w:val="yellow"/>
         </w:rPr>
-        <w:t xml:space="preserve">[dd/mm/2026]</w:t>
+        <w:t xml:space="preserve">[dd/06/2026]</w:t>
       </w:r>
       <w:r>
         <w:t xml:space="preserve">) i a la data d'aquest escrit. Aquest import no és inferior al valor estimat de l'Acord marc per al lot 1.</w:t>
@@ -1600,34 +1836,24 @@
         <w:jc w:val="both"/>
       </w:pPr>
       <w:r>
-        <w:t xml:space="preserve">a) Equip docent. En la proposta tècnica avaluable automàticament (sobre C, annex 14), l'empresa es va comprometre a adscriure a l'execució dels contractes basats un equip de 17 docents amb una experiència professional mínima de 5 anys en formació TIC, compost en un </w:t>
+        <w:t xml:space="preserve">a) Equip docent. En la proposta tècnica avaluable automàticament (sobre C, annex 14), l'empresa es va comprometre a adscriure a l'execució dels contractes basats un equip de 17 docents amb una experiència professional mínima de 5 anys en formació TIC, compost en un 52,9 % per dones. La relació aportada (document 3) identifica les 17 persones que formen aquest equip, de les quals </w:t>
       </w:r>
       <w:r>
         <w:rPr>
           <w:highlight w:val="yellow"/>
           <w:highlightCs w:val="yellow"/>
         </w:rPr>
-        <w:t xml:space="preserve">[XX]</w:t>
-      </w:r>
-      <w:r>
-        <w:t xml:space="preserve"> % per dones. La relació aportada (document 3) identifica les 17 persones que formen aquest equip, de les quals </w:t>
+        <w:t xml:space="preserve">[9]</w:t>
+      </w:r>
+      <w:r>
+        <w:t xml:space="preserve"> són dones (</w:t>
       </w:r>
       <w:r>
         <w:rPr>
           <w:highlight w:val="yellow"/>
           <w:highlightCs w:val="yellow"/>
         </w:rPr>
-        <w:t xml:space="preserve">[n]</w:t>
-      </w:r>
-      <w:r>
-        <w:t xml:space="preserve"> són dones (</w:t>
-      </w:r>
-      <w:r>
-        <w:rPr>
-          <w:highlight w:val="yellow"/>
-          <w:highlightCs w:val="yellow"/>
-        </w:rPr>
-        <w:t xml:space="preserve">[XX]</w:t>
+        <w:t xml:space="preserve">[52,9]</w:t>
       </w:r>
       <w:r>
         <w:t xml:space="preserve"> %), de manera que es manté, com a mínim, la proporció compromesa.</w:t>
@@ -1853,21 +2079,17 @@
         <w:jc w:val="left"/>
       </w:pPr>
       <w:r>
+        <w:t xml:space="preserve">Rafael Cortés </w:t>
+      </w:r>
+      <w:r>
         <w:rPr>
           <w:highlight w:val="yellow"/>
           <w:highlightCs w:val="yellow"/>
         </w:rPr>
-        <w:t xml:space="preserve">[Nom i cognoms]</w:t>
-      </w:r>
-      <w:r>
-        <w:t xml:space="preserve"> · </w:t>
-      </w:r>
-      <w:r>
-        <w:rPr>
-          <w:highlight w:val="yellow"/>
-          <w:highlightCs w:val="yellow"/>
-        </w:rPr>
-        <w:t xml:space="preserve">[Càrrec]</w:t>
+        <w:t xml:space="preserve">[Contreras]</w:t>
+      </w:r>
+      <w:r>
+        <w:t xml:space="preserve"> · Representant de MULTIMÈDIA TARRAGONA, SL</w:t>
       </w:r>
     </w:p>
     <w:sectPr>

</xml_diff>

<commit_message>
EAPC-2026-53 L1: assegurança RC segons el pressupost d'Allianz
- Escrit, DR i portada de solvència econòmica amb les dades del pressupost
  (RC professional 1.588.680 EUR per sinistre, efectes 06/10/2026) i amb
  referència al compromís de l'annex 4.f del sobre A.
- Guia: anàlisi del pressupost, risc de vigència i correccions a demanar
  a la corredoria (descripció de l'activitat i nombre d'alumnes).

Co-Authored-By: Claude Opus 5.5 <noreply@anthropic.com>
Claude-Session: https://claude.ai/code/session_01UnwSqujbqZGJWPhwR4jWPM
</commit_message>
<xml_diff>
--- a/projectes/EAPC/EAPC-2026-53_AM_TIC/requeriment_150-2/01_Escrit_resposta_requeriment_EAPC-2026-53_L1.docx
+++ b/projectes/EAPC/EAPC-2026-53_AM_TIC/requeriment_150-2/01_Escrit_resposta_requeriment_EAPC-2026-53_L1.docx
@@ -696,23 +696,7 @@
                 <w:sz w:val="17"/>
                 <w:szCs w:val="17"/>
               </w:rPr>
-              <w:t xml:space="preserve">Certificat de l'entitat asseguradora </w:t>
-            </w:r>
-            <w:r>
-              <w:rPr>
-                <w:sz w:val="17"/>
-                <w:szCs w:val="17"/>
-                <w:highlight w:val="yellow"/>
-                <w:highlightCs w:val="yellow"/>
-              </w:rPr>
-              <w:t xml:space="preserve">[nom de la companyia]</w:t>
-            </w:r>
-            <w:r>
-              <w:rPr>
-                <w:sz w:val="17"/>
-                <w:szCs w:val="17"/>
-              </w:rPr>
-              <w:t xml:space="preserve"> relatiu a la pòlissa d'assegurança de responsabilitat civil professional núm. </w:t>
+              <w:t xml:space="preserve">Certificat d'Allianz, Compañía de Seguros y Reaseguros, SA relatiu a la pòlissa de responsabilitat civil (garantia de responsabilitat civil professional inclosa) núm. </w:t>
             </w:r>
             <w:r>
               <w:rPr>
@@ -1700,27 +1684,27 @@
         <w:jc w:val="both"/>
       </w:pPr>
       <w:r>
-        <w:t xml:space="preserve">El certificat aportat com a document 1 acredita que l'empresa disposa d'una assegurança d'indemnització per riscos professionals amb un capital assegurat de </w:t>
+        <w:t xml:space="preserve">El certificat aportat com a document 1 acredita que l'empresa disposa d'una assegurança de responsabilitat civil contractada amb Allianz, Compañía de Seguros y Reaseguros, SA, pòlissa núm. </w:t>
       </w:r>
       <w:r>
         <w:rPr>
           <w:highlight w:val="yellow"/>
           <w:highlightCs w:val="yellow"/>
         </w:rPr>
-        <w:t xml:space="preserve">[import]</w:t>
-      </w:r>
-      <w:r>
-        <w:t xml:space="preserve"> €, vigent en la data final de presentació d'ofertes (</w:t>
+        <w:t xml:space="preserve">[número de pòlissa]</w:t>
+      </w:r>
+      <w:r>
+        <w:t xml:space="preserve">, que inclou la garantia de responsabilitat civil professional amb un límit de 1.588.680,00 € per sinistre i de 4.766.040,00 € per anualitat, amb efectes des del </w:t>
       </w:r>
       <w:r>
         <w:rPr>
           <w:highlight w:val="yellow"/>
           <w:highlightCs w:val="yellow"/>
         </w:rPr>
-        <w:t xml:space="preserve">[dd/06/2026]</w:t>
-      </w:r>
-      <w:r>
-        <w:t xml:space="preserve">) i a la data d'aquest escrit. Aquest import no és inferior al valor estimat de l'Acord marc per al lot 1.</w:t>
+        <w:t xml:space="preserve">[06/10/2026]</w:t>
+      </w:r>
+      <w:r>
+        <w:t xml:space="preserve"> i renovable anualment. El límit per sinistre és igual al valor estimat de l'Acord marc per al lot 1 (1.588.680,00 €).</w:t>
       </w:r>
     </w:p>
     <w:p>
@@ -1729,7 +1713,16 @@
         <w:jc w:val="both"/>
       </w:pPr>
       <w:r>
-        <w:t xml:space="preserve">Fem constar que el text del requeriment esmenta un import de 1.558.680,00 €, mentre que l'apartat G1 del quadre de característiques del PCAP i la taula del mateix requeriment indiquen un valor estimat de 1.588.680,00 €. La cobertura acreditada és igual o superior a 1.588.680,00 € i, per tant, compleix qualsevol dels dos imports.</w:t>
+        <w:t xml:space="preserve">Aquesta pòlissa s'ha subscrit en compliment del compromís que l'empresa va assumir a la declaració responsable del sobre A (annex 4 del PCAP, apartat f), d'acord amb el qual, en cas de resultar adjudicatària, es comprometia a disposar d'una assegurança d'indemnització per riscos professionals per l'import de la solvència requerida i a renovar-la o prorrogar-la durant tota l'execució del contracte.</w:t>
+      </w:r>
+    </w:p>
+    <w:p>
+      <w:pPr>
+        <w:spacing w:after="120" w:before="0" w:line="276"/>
+        <w:jc w:val="both"/>
+      </w:pPr>
+      <w:r>
+        <w:t xml:space="preserve">Fem constar que el text del requeriment esmenta un import de 1.558.680,00 €, mentre que l'apartat G1 del quadre de característiques del PCAP i la taula del mateix requeriment indiquen un valor estimat de 1.588.680,00 €. La cobertura acreditada és de 1.588.680,00 € per sinistre i, per tant, compleix qualsevol dels dos imports.</w:t>
       </w:r>
     </w:p>
     <w:p>

</xml_diff>

<commit_message>
EAPC-2026-53 L1: revisió de la pòlissa Occident i domicili social confirmat
- Domicili social: C. Joana Jugan, 2, 43002 Tarragona (confirmat per la
  pòlissa i l'annex 14) a tots els documents.
- Guia: la pòlissa Occident no inclou RC professional (límit 300.000 EUR);
  cal acreditar ara la nova assegurança (requeriment art. 150.2 LCSP).

Co-Authored-By: Claude Opus 5.5 <noreply@anthropic.com>
Claude-Session: https://claude.ai/code/session_01UnwSqujbqZGJWPhwR4jWPM
</commit_message>
<xml_diff>
--- a/projectes/EAPC/EAPC-2026-53_AM_TIC/requeriment_150-2/01_Escrit_resposta_requeriment_EAPC-2026-53_L1.docx
+++ b/projectes/EAPC/EAPC-2026-53_AM_TIC/requeriment_150-2/01_Escrit_resposta_requeriment_EAPC-2026-53_L1.docx
@@ -437,17 +437,7 @@
         <w:t xml:space="preserve">[Contreras]</w:t>
       </w:r>
       <w:r>
-        <w:t xml:space="preserve">, amb NIF 39912250M, en nom i representació de MULTIMÈDIA TARRAGONA, SL, amb NIF B43492784 i domicili social a </w:t>
-      </w:r>
-      <w:r>
-        <w:rPr>
-          <w:highlight w:val="yellow"/>
-          <w:highlightCs w:val="yellow"/>
-        </w:rPr>
-        <w:t xml:space="preserve">[C. Joana Jugan, 2, Tarragona (segons l'oferta) / C. Apodaca, 6, 1r A, 43004 Tarragona (segons el requeriment): comprovar el domicili social]</w:t>
-      </w:r>
-      <w:r>
-        <w:t xml:space="preserve">, segons poders atorgats davant el notari Manuel Carlos Estrada del Castillo en data 13/12/2018, amb número de protocol 2654,</w:t>
+        <w:t xml:space="preserve">, amb NIF 39912250M, en nom i representació de MULTIMÈDIA TARRAGONA, SL, amb NIF B43492784 i domicili social a C. Joana Jugan, 2, 43002 Tarragona, segons poders atorgats davant el notari Manuel Carlos Estrada del Castillo en data 13/12/2018, amb número de protocol 2654,</w:t>
       </w:r>
     </w:p>
     <w:p>

</xml_diff>

<commit_message>
EAPC-2026-53 L1: segon cognom del representant confirmat (Contreras)
Co-Authored-By: Claude Opus 5.5 <noreply@anthropic.com>
Claude-Session: https://claude.ai/code/session_01UnwSqujbqZGJWPhwR4jWPM
</commit_message>
<xml_diff>
--- a/projectes/EAPC/EAPC-2026-53_AM_TIC/requeriment_150-2/01_Escrit_resposta_requeriment_EAPC-2026-53_L1.docx
+++ b/projectes/EAPC/EAPC-2026-53_AM_TIC/requeriment_150-2/01_Escrit_resposta_requeriment_EAPC-2026-53_L1.docx
@@ -427,17 +427,7 @@
         <w:jc w:val="both"/>
       </w:pPr>
       <w:r>
-        <w:t xml:space="preserve">Rafael Cortés </w:t>
-      </w:r>
-      <w:r>
-        <w:rPr>
-          <w:highlight w:val="yellow"/>
-          <w:highlightCs w:val="yellow"/>
-        </w:rPr>
-        <w:t xml:space="preserve">[Contreras]</w:t>
-      </w:r>
-      <w:r>
-        <w:t xml:space="preserve">, amb NIF 39912250M, en nom i representació de MULTIMÈDIA TARRAGONA, SL, amb NIF B43492784 i domicili social a C. Joana Jugan, 2, 43002 Tarragona, segons poders atorgats davant el notari Manuel Carlos Estrada del Castillo en data 13/12/2018, amb número de protocol 2654,</w:t>
+        <w:t xml:space="preserve">Rafael Cortés Contreras, amb NIF 39912250M, en nom i representació de MULTIMÈDIA TARRAGONA, SL, amb NIF B43492784 i domicili social a C. Joana Jugan, 2, 43002 Tarragona, segons poders atorgats davant el notari Manuel Carlos Estrada del Castillo en data 13/12/2018, amb número de protocol 2654,</w:t>
       </w:r>
     </w:p>
     <w:p>
@@ -2062,17 +2052,7 @@
         <w:jc w:val="left"/>
       </w:pPr>
       <w:r>
-        <w:t xml:space="preserve">Rafael Cortés </w:t>
-      </w:r>
-      <w:r>
-        <w:rPr>
-          <w:highlight w:val="yellow"/>
-          <w:highlightCs w:val="yellow"/>
-        </w:rPr>
-        <w:t xml:space="preserve">[Contreras]</w:t>
-      </w:r>
-      <w:r>
-        <w:t xml:space="preserve"> · Representant de MULTIMÈDIA TARRAGONA, SL</w:t>
+        <w:t xml:space="preserve">Rafael Cortés Contreras · Representant de MULTIMÈDIA TARRAGONA, SL</w:t>
       </w:r>
     </w:p>
     <w:sectPr>

</xml_diff>

<commit_message>
EAPC-2026-53 L1: dades de la pòlissa Helvetia E2 R18 0000733
- Escrit, DR de renovació i portada de solvència econòmica amb l'asseguradora,
  el número de pòlissa, la data d'efecte (08/10/2026) i l'activitat assegurada.
- Guia: anàlisi del certificat i pagament pendent del rebut.

Co-Authored-By: Claude Opus 5.5 <noreply@anthropic.com>
Claude-Session: https://claude.ai/code/session_01UnwSqujbqZGJWPhwR4jWPM
</commit_message>
<xml_diff>
--- a/projectes/EAPC/EAPC-2026-53_AM_TIC/requeriment_150-2/01_Escrit_resposta_requeriment_EAPC-2026-53_L1.docx
+++ b/projectes/EAPC/EAPC-2026-53_AM_TIC/requeriment_150-2/01_Escrit_resposta_requeriment_EAPC-2026-53_L1.docx
@@ -676,16 +676,7 @@
                 <w:sz w:val="17"/>
                 <w:szCs w:val="17"/>
               </w:rPr>
-              <w:t xml:space="preserve">Certificat d'Allianz, Compañía de Seguros y Reaseguros, SA relatiu a la pòlissa de responsabilitat civil (garantia de responsabilitat civil professional inclosa) núm. </w:t>
-            </w:r>
-            <w:r>
-              <w:rPr>
-                <w:sz w:val="17"/>
-                <w:szCs w:val="17"/>
-                <w:highlight w:val="yellow"/>
-                <w:highlightCs w:val="yellow"/>
-              </w:rPr>
-              <w:t xml:space="preserve">[número de pòlissa]</w:t>
+              <w:t xml:space="preserve">Certificat de Caja de Seguros Reunidos, Compañía de Seguros y Reaseguros, SA (Helvetia Seguros) relatiu a la pòlissa de responsabilitat civil (garantia de responsabilitat civil professional inclosa) núm. E2 R18 0000733</w:t>
             </w:r>
           </w:p>
         </w:tc>
@@ -1664,27 +1655,7 @@
         <w:jc w:val="both"/>
       </w:pPr>
       <w:r>
-        <w:t xml:space="preserve">El certificat aportat com a document 1 acredita que l'empresa disposa d'una assegurança de responsabilitat civil contractada amb Allianz, Compañía de Seguros y Reaseguros, SA, pòlissa núm. </w:t>
-      </w:r>
-      <w:r>
-        <w:rPr>
-          <w:highlight w:val="yellow"/>
-          <w:highlightCs w:val="yellow"/>
-        </w:rPr>
-        <w:t xml:space="preserve">[número de pòlissa]</w:t>
-      </w:r>
-      <w:r>
-        <w:t xml:space="preserve">, que inclou la garantia de responsabilitat civil professional amb un límit de 1.588.680,00 € per sinistre i de 4.766.040,00 € per anualitat, amb efectes des del </w:t>
-      </w:r>
-      <w:r>
-        <w:rPr>
-          <w:highlight w:val="yellow"/>
-          <w:highlightCs w:val="yellow"/>
-        </w:rPr>
-        <w:t xml:space="preserve">[06/10/2026]</w:t>
-      </w:r>
-      <w:r>
-        <w:t xml:space="preserve"> i renovable anualment. El límit per sinistre és igual al valor estimat de l'Acord marc per al lot 1 (1.588.680,00 €).</w:t>
+        <w:t xml:space="preserve">El certificat aportat com a document 1 acredita que l'empresa disposa d'una assegurança de responsabilitat civil contractada amb Caja de Seguros Reunidos, Compañía de Seguros y Reaseguros, SA (Helvetia Seguros), pòlissa núm. E2 R18 0000733, que inclou la garantia de responsabilitat civil professional amb un límit de 1.588.680,00 € per sinistre i també per anualitat, amb efectes des del 08/10/2026 i renovable anualment. La pòlissa identifica com a activitat assegurada l'«Acord marc EAPC-2026-53, lot 1» (formació professional per a l'ocupació, formació contínua i formació per a l'Administració pública, en modalitat presencial, en línia síncrona i asíncrona). El límit per sinistre és igual al valor estimat de l'Acord marc per al lot 1 (1.588.680,00 €).</w:t>
       </w:r>
     </w:p>
     <w:p>

</xml_diff>